<commit_message>
Resume: list DesignLab and UC Berkeley separately
Co-Authored-By: Claude Opus 5.5 <noreply@anthropic.com>
Claude-Session: https://claude.ai/code/session_01BWS5PCRjFeAZF9aTGuRUn3
</commit_message>
<xml_diff>
--- a/resume/resume-lorraine-kim.docx
+++ b/resume/resume-lorraine-kim.docx
@@ -124,7 +124,7 @@
         <w:spacing w:after="20"/>
       </w:pPr>
       <w:r>
-        <w:t>Used live logs to find that the 30-day comparison read “low” in 68 of 75 readings during a steady trend, and changed the copy.</w:t>
+        <w:t>Found in live logs that the 30-day comparison read “low” 68 of 75 times during a steady trend, and revised the copy.</w:t>
       </w:r>
     </w:p>
     <w:p>
@@ -169,7 +169,7 @@
         <w:spacing w:after="20"/>
       </w:pPr>
       <w:r>
-        <w:t>Interviewed 5 practitioners across 4 buy-side firms and tested with 5 operators. 4 finished, with an average ease rating of 4.75 out of 5.</w:t>
+        <w:t>Interviewed 5 practitioners at 4 buy-side firms and tested with 5 operators: 4 finished, rating ease 4.75 of 5.</w:t>
       </w:r>
     </w:p>
     <w:p>
@@ -499,7 +499,34 @@
         <w:rPr>
           <w:color w:val="63676A"/>
         </w:rPr>
-        <w:t xml:space="preserve"> · UX Academy, 2023 – 2024 · University of California, Berkeley, B.A. Legal Studies</w:t>
+        <w:t xml:space="preserve"> · UX Academy</w:t>
+      </w:r>
+      <w:r>
+        <w:rPr>
+          <w:color w:val="63676A"/>
+        </w:rPr>
+        <w:tab/>
+        <w:t>2023 – 2024</w:t>
+      </w:r>
+    </w:p>
+    <w:p>
+      <w:pPr>
+        <w:tabs>
+          <w:tab w:pos="10512" w:val="right"/>
+        </w:tabs>
+        <w:spacing w:after="0" w:before="0"/>
+      </w:pPr>
+      <w:r>
+        <w:rPr>
+          <w:b/>
+        </w:rPr>
+        <w:t>University of California, Berkeley</w:t>
+      </w:r>
+      <w:r>
+        <w:rPr>
+          <w:color w:val="63676A"/>
+        </w:rPr>
+        <w:t xml:space="preserve"> · B.A. Legal Studies</w:t>
       </w:r>
       <w:r>
         <w:rPr>

</xml_diff>

<commit_message>
Preview: white and black palette (site and resume), no accent color
Co-Authored-By: Claude Opus 5.5 <noreply@anthropic.com>
Claude-Session: https://claude.ai/code/session_01BWS5PCRjFeAZF9aTGuRUn3
</commit_message>
<xml_diff>
--- a/resume/resume-lorraine-kim.docx
+++ b/resume/resume-lorraine-kim.docx
@@ -21,7 +21,7 @@
       <w:r>
         <w:rPr>
           <w:b/>
-          <w:color w:val="3D7368"/>
+          <w:color w:val="111111"/>
           <w:sz w:val="20"/>
         </w:rPr>
         <w:t>Product Designer</w:t>
@@ -34,7 +34,7 @@
       <w:r>
         <w:rPr>
           <w:b w:val="0"/>
-          <w:color w:val="63676A"/>
+          <w:color w:val="6B6B6B"/>
           <w:sz w:val="18"/>
         </w:rPr>
         <w:t>San Mateo, CA · lorraine.kim@gmail.com · 347-271-2651 · lorrainekim.com · linkedin.com/in/lorrkim</w:t>
@@ -58,7 +58,7 @@
       <w:r>
         <w:rPr>
           <w:b/>
-          <w:color w:val="3D7368"/>
+          <w:color w:val="111111"/>
           <w:sz w:val="16"/>
         </w:rPr>
         <w:t>SELECTED PRODUCT WORK</w:t>
@@ -79,13 +79,13 @@
       </w:r>
       <w:r>
         <w:rPr>
-          <w:color w:val="63676A"/>
+          <w:color w:val="6B6B6B"/>
         </w:rPr>
         <w:t xml:space="preserve"> · Exchange-rate widget for people who send money abroad</w:t>
       </w:r>
       <w:r>
         <w:rPr>
-          <w:color w:val="63676A"/>
+          <w:color w:val="6B6B6B"/>
         </w:rPr>
         <w:tab/>
         <w:t>Live · Nov 2025 – Oct 2026</w:t>
@@ -142,13 +142,13 @@
       </w:r>
       <w:r>
         <w:rPr>
-          <w:color w:val="63676A"/>
+          <w:color w:val="6B6B6B"/>
         </w:rPr>
         <w:t xml:space="preserve"> · Reconciliation add-on for small middle-office teams</w:t>
       </w:r>
       <w:r>
         <w:rPr>
-          <w:color w:val="63676A"/>
+          <w:color w:val="6B6B6B"/>
         </w:rPr>
         <w:tab/>
         <w:t>Working prototype · 12 weeks</w:t>
@@ -205,13 +205,13 @@
       </w:r>
       <w:r>
         <w:rPr>
-          <w:color w:val="63676A"/>
+          <w:color w:val="6B6B6B"/>
         </w:rPr>
         <w:t xml:space="preserve"> · Website for a Korean modernist painter’s estate</w:t>
       </w:r>
       <w:r>
         <w:rPr>
-          <w:color w:val="63676A"/>
+          <w:color w:val="6B6B6B"/>
         </w:rPr>
         <w:tab/>
         <w:t>Paid client · 9 weeks · Live</w:t>
@@ -233,7 +233,7 @@
       <w:r>
         <w:rPr>
           <w:b/>
-          <w:color w:val="3D7368"/>
+          <w:color w:val="111111"/>
           <w:sz w:val="16"/>
         </w:rPr>
         <w:t>DESIGN EXPERIENCE</w:t>
@@ -254,13 +254,13 @@
       </w:r>
       <w:r>
         <w:rPr>
-          <w:color w:val="63676A"/>
+          <w:color w:val="6B6B6B"/>
         </w:rPr>
         <w:t xml:space="preserve"> · Product Designer (independent studio), San Francisco</w:t>
       </w:r>
       <w:r>
         <w:rPr>
-          <w:color w:val="63676A"/>
+          <w:color w:val="6B6B6B"/>
         </w:rPr>
         <w:tab/>
         <w:t>2024 – Present</w:t>
@@ -282,7 +282,7 @@
       <w:r>
         <w:rPr>
           <w:b/>
-          <w:color w:val="3D7368"/>
+          <w:color w:val="111111"/>
           <w:sz w:val="16"/>
         </w:rPr>
         <w:t>INSTITUTIONAL FINANCE (NON-DESIGN ROLES)</w:t>
@@ -303,13 +303,13 @@
       </w:r>
       <w:r>
         <w:rPr>
-          <w:color w:val="63676A"/>
+          <w:color w:val="6B6B6B"/>
         </w:rPr>
         <w:t xml:space="preserve"> · AIM Trading Analyst, San Francisco</w:t>
       </w:r>
       <w:r>
         <w:rPr>
-          <w:color w:val="63676A"/>
+          <w:color w:val="6B6B6B"/>
         </w:rPr>
         <w:tab/>
         <w:t>2020 – 2022</w:t>
@@ -348,13 +348,13 @@
       </w:r>
       <w:r>
         <w:rPr>
-          <w:color w:val="63676A"/>
+          <w:color w:val="6B6B6B"/>
         </w:rPr>
         <w:t xml:space="preserve"> · AVP, Trading Operations, New York</w:t>
       </w:r>
       <w:r>
         <w:rPr>
-          <w:color w:val="63676A"/>
+          <w:color w:val="6B6B6B"/>
         </w:rPr>
         <w:tab/>
         <w:t>2009 – 2020</w:t>
@@ -393,13 +393,13 @@
       </w:r>
       <w:r>
         <w:rPr>
-          <w:color w:val="63676A"/>
+          <w:color w:val="6B6B6B"/>
         </w:rPr>
         <w:t xml:space="preserve"> · Associate Portfolio Manager, New York</w:t>
       </w:r>
       <w:r>
         <w:rPr>
-          <w:color w:val="63676A"/>
+          <w:color w:val="6B6B6B"/>
         </w:rPr>
         <w:tab/>
         <w:t>2007 – 2009</w:t>
@@ -421,7 +421,7 @@
       <w:r>
         <w:rPr>
           <w:b/>
-          <w:color w:val="3D7368"/>
+          <w:color w:val="111111"/>
           <w:sz w:val="16"/>
         </w:rPr>
         <w:t>SKILLS</w:t>
@@ -476,7 +476,7 @@
       <w:r>
         <w:rPr>
           <w:b/>
-          <w:color w:val="3D7368"/>
+          <w:color w:val="111111"/>
           <w:sz w:val="16"/>
         </w:rPr>
         <w:t>EDUCATION</w:t>
@@ -497,13 +497,13 @@
       </w:r>
       <w:r>
         <w:rPr>
-          <w:color w:val="63676A"/>
+          <w:color w:val="6B6B6B"/>
         </w:rPr>
         <w:t xml:space="preserve"> · UX Academy</w:t>
       </w:r>
       <w:r>
         <w:rPr>
-          <w:color w:val="63676A"/>
+          <w:color w:val="6B6B6B"/>
         </w:rPr>
         <w:tab/>
         <w:t>2023 – 2024</w:t>
@@ -524,13 +524,13 @@
       </w:r>
       <w:r>
         <w:rPr>
-          <w:color w:val="63676A"/>
+          <w:color w:val="6B6B6B"/>
         </w:rPr>
         <w:t xml:space="preserve"> · B.A. Legal Studies</w:t>
       </w:r>
       <w:r>
         <w:rPr>
-          <w:color w:val="63676A"/>
+          <w:color w:val="6B6B6B"/>
         </w:rPr>
         <w:tab/>
       </w:r>

</xml_diff>